<commit_message>
updating experience and skills sections
</commit_message>
<xml_diff>
--- a/public/Wells-Ethan.docx
+++ b/public/Wells-Ethan.docx
@@ -234,14 +234,7 @@
           <w:lang w:val="en-US"/>
         </w:rPr>
         <w:tab/>
-      </w:r>
-      <w:r>
-        <w:rPr>
-          <w:bCs/>
-          <w:szCs w:val="22"/>
-          <w:lang w:val="en-US"/>
-        </w:rPr>
-        <w:t>TypeScript/ JavaScript, Python, C#</w:t>
+        <w:t>TypeScript, JavaScript, Python, C#</w:t>
       </w:r>
     </w:p>
     <w:p>
@@ -271,14 +264,7 @@
           <w:lang w:val="en-US"/>
         </w:rPr>
         <w:tab/>
-      </w:r>
-      <w:r>
-        <w:rPr>
-          <w:bCs/>
-          <w:szCs w:val="22"/>
-          <w:lang w:val="en-US"/>
-        </w:rPr>
-        <w:t>React.js, Next.js, Vue.js, HTML, CSS</w:t>
+        <w:t>React, Next.js, Vue, HTML, CSS</w:t>
       </w:r>
     </w:p>
     <w:p>
@@ -308,14 +294,7 @@
           <w:lang w:val="en-US"/>
         </w:rPr>
         <w:tab/>
-      </w:r>
-      <w:r>
-        <w:rPr>
-          <w:bCs/>
-          <w:szCs w:val="22"/>
-          <w:lang w:val="en-US"/>
-        </w:rPr>
-        <w:t>Node.js, Express.js, Nest.js, .NET</w:t>
+        <w:t>FastAPI, Node.js, Express.js, Nest.js, .NET</w:t>
       </w:r>
     </w:p>
     <w:p>
@@ -345,14 +324,7 @@
           <w:lang w:val="en-US"/>
         </w:rPr>
         <w:tab/>
-      </w:r>
-      <w:r>
-        <w:rPr>
-          <w:bCs/>
-          <w:szCs w:val="22"/>
-          <w:lang w:val="en-US"/>
-        </w:rPr>
-        <w:t>DynamoDB, Microsoft SQL Server, PostgreSQL</w:t>
+        <w:t>Neo4j, DynamoDB, Microsoft SQL Server, PostgreSQL</w:t>
       </w:r>
     </w:p>
     <w:p>
@@ -382,13 +354,6 @@
           <w:lang w:val="en-US"/>
         </w:rPr>
         <w:tab/>
-      </w:r>
-      <w:r>
-        <w:rPr>
-          <w:bCs/>
-          <w:szCs w:val="22"/>
-          <w:lang w:val="en-US"/>
-        </w:rPr>
         <w:t>AWS, Azure, Terraform</w:t>
       </w:r>
     </w:p>
@@ -413,11 +378,41 @@
       </w:r>
       <w:r>
         <w:rPr>
+          <w:b/>
           <w:szCs w:val="22"/>
           <w:lang w:val="en-US"/>
         </w:rPr>
         <w:tab/>
         <w:t>Git, CI/CD, DevOps, Agile</w:t>
+      </w:r>
+    </w:p>
+    <w:p>
+      <w:pPr>
+        <w:tabs>
+          <w:tab w:val="right" w:pos="10800"/>
+        </w:tabs>
+        <w:ind w:left="14" w:hanging="14"/>
+        <w:rPr>
+          <w:szCs w:val="22"/>
+          <w:lang w:val="en-US"/>
+        </w:rPr>
+      </w:pPr>
+      <w:r>
+        <w:rPr>
+          <w:b/>
+          <w:szCs w:val="22"/>
+          <w:lang w:val="en-US"/>
+        </w:rPr>
+        <w:t>AI Tools:</w:t>
+      </w:r>
+      <w:r>
+        <w:rPr>
+          <w:b/>
+          <w:szCs w:val="22"/>
+          <w:lang w:val="en-US"/>
+        </w:rPr>
+        <w:tab/>
+        <w:t>Claude Code, GitHub Copilot</w:t>
       </w:r>
     </w:p>
     <w:p>
@@ -536,23 +531,7 @@
           <w:szCs w:val="22"/>
           <w:lang w:val="en-US"/>
         </w:rPr>
-        <w:t xml:space="preserve">Lead development on the Digital Twin </w:t>
-      </w:r>
-      <w:r>
-        <w:rPr>
-          <w:bCs/>
-          <w:szCs w:val="22"/>
-          <w:lang w:val="en-US"/>
-        </w:rPr>
-        <w:t xml:space="preserve">innovation </w:t>
-      </w:r>
-      <w:r>
-        <w:rPr>
-          <w:bCs/>
-          <w:szCs w:val="22"/>
-          <w:lang w:val="en-US"/>
-        </w:rPr>
-        <w:t>project within INVISTA</w:t>
+        <w:t>Led development of an enterprise Digital Twin platform integrating Matterport 3D twins and Neo4j across multiple industrial sites</w:t>
       </w:r>
     </w:p>
     <w:p>
@@ -573,7 +552,7 @@
         </w:rPr>
       </w:pPr>
       <w:r>
-        <w:t>Created architecture diagrams that facilitated scalable and maintainable software solutions</w:t>
+        <w:t>Built and extended ETL pipelines ingesting operations data from third-party systems (procedures, sensor data, engineering drawings) into Neo4j, powering the Digital Twin and AI chat assistants</w:t>
       </w:r>
     </w:p>
     <w:p>
@@ -599,55 +578,7 @@
           <w:szCs w:val="22"/>
           <w:lang w:val="en-US"/>
         </w:rPr>
-        <w:t xml:space="preserve">Collaborated with </w:t>
-      </w:r>
-      <w:r>
-        <w:rPr>
-          <w:bCs/>
-          <w:szCs w:val="22"/>
-          <w:lang w:val="en-US"/>
-        </w:rPr>
-        <w:t>O</w:t>
-      </w:r>
-      <w:r>
-        <w:rPr>
-          <w:bCs/>
-          <w:szCs w:val="22"/>
-          <w:lang w:val="en-US"/>
-        </w:rPr>
-        <w:t>perators to design a</w:t>
-      </w:r>
-      <w:r>
-        <w:rPr>
-          <w:bCs/>
-          <w:szCs w:val="22"/>
-          <w:lang w:val="en-US"/>
-        </w:rPr>
-        <w:t xml:space="preserve">n application that empowers </w:t>
-      </w:r>
-      <w:r>
-        <w:rPr>
-          <w:bCs/>
-          <w:szCs w:val="22"/>
-          <w:lang w:val="en-US"/>
-        </w:rPr>
-        <w:t xml:space="preserve">them </w:t>
-      </w:r>
-      <w:r>
-        <w:rPr>
-          <w:bCs/>
-          <w:szCs w:val="22"/>
-          <w:lang w:val="en-US"/>
-        </w:rPr>
-        <w:t xml:space="preserve">and aids </w:t>
-      </w:r>
-      <w:r>
-        <w:rPr>
-          <w:bCs/>
-          <w:szCs w:val="22"/>
-          <w:lang w:val="en-US"/>
-        </w:rPr>
-        <w:t>their efficiency</w:t>
+        <w:t>Reduced time to ship new AI agents from days to hours, enabling the team to rapidly scale the platform</w:t>
       </w:r>
     </w:p>
     <w:p>
@@ -673,101 +604,7 @@
           <w:szCs w:val="22"/>
           <w:lang w:val="en-US"/>
         </w:rPr>
-        <w:t>Connect</w:t>
-      </w:r>
-      <w:r>
-        <w:rPr>
-          <w:bCs/>
-          <w:szCs w:val="22"/>
-          <w:lang w:val="en-US"/>
-        </w:rPr>
-        <w:t xml:space="preserve">ed </w:t>
-      </w:r>
-      <w:r>
-        <w:rPr>
-          <w:bCs/>
-          <w:szCs w:val="22"/>
-          <w:lang w:val="en-US"/>
-        </w:rPr>
-        <w:t>with Project Managers and Site Champions to plan out timelines for high priority features</w:t>
-      </w:r>
-    </w:p>
-    <w:p>
-      <w:pPr>
-        <w:tabs>
-          <w:tab w:val="right" w:pos="10800"/>
-        </w:tabs>
-        <w:rPr>
-          <w:bCs/>
-          <w:szCs w:val="22"/>
-          <w:lang w:val="en-US"/>
-        </w:rPr>
-      </w:pPr>
-    </w:p>
-    <w:p>
-      <w:pPr>
-        <w:tabs>
-          <w:tab w:val="right" w:pos="10800"/>
-        </w:tabs>
-        <w:rPr>
-          <w:bCs/>
-          <w:szCs w:val="22"/>
-          <w:lang w:val="en-US"/>
-        </w:rPr>
-      </w:pPr>
-      <w:r>
-        <w:rPr>
-          <w:b/>
-          <w:szCs w:val="22"/>
-          <w:lang w:val="en-US"/>
-        </w:rPr>
-        <w:t>Software Engineer</w:t>
-      </w:r>
-      <w:r>
-        <w:rPr>
-          <w:b/>
-          <w:szCs w:val="22"/>
-          <w:lang w:val="en-US"/>
-        </w:rPr>
-        <w:tab/>
-      </w:r>
-      <w:r>
-        <w:rPr>
-          <w:bCs/>
-          <w:szCs w:val="22"/>
-          <w:lang w:val="en-US"/>
-        </w:rPr>
-        <w:t>April 2022 – July 2023</w:t>
-      </w:r>
-    </w:p>
-    <w:p>
-      <w:pPr>
-        <w:tabs>
-          <w:tab w:val="right" w:pos="10800"/>
-        </w:tabs>
-        <w:rPr>
-          <w:bCs/>
-          <w:szCs w:val="22"/>
-          <w:lang w:val="en-US"/>
-        </w:rPr>
-      </w:pPr>
-      <w:proofErr w:type="spellStart"/>
-      <w:r>
-        <w:rPr>
-          <w:bCs/>
-          <w:szCs w:val="22"/>
-          <w:lang w:val="en-US"/>
-        </w:rPr>
-        <w:t>StaffWise</w:t>
-      </w:r>
-      <w:proofErr w:type="spellEnd"/>
-      <w:r>
-        <w:rPr>
-          <w:bCs/>
-          <w:szCs w:val="22"/>
-          <w:lang w:val="en-US"/>
-        </w:rPr>
-        <w:t>, Wichita, KS</w:t>
+        <w:t>Eliminated manual deployments across all agent services through automated CI/CD and infrastructure-as-code</w:t>
       </w:r>
     </w:p>
     <w:p>
@@ -793,7 +630,85 @@
           <w:szCs w:val="22"/>
           <w:lang w:val="en-US"/>
         </w:rPr>
-        <w:t>Enforcing TDD using Clean Architecture for maintainable and testable code</w:t>
+        <w:t>Established Claude Code as the team's primary development workflow, setting up the codebase and tooling to maximize AI-assisted development</w:t>
+      </w:r>
+    </w:p>
+    <w:p>
+      <w:pPr>
+        <w:tabs>
+          <w:tab w:val="right" w:pos="10800"/>
+        </w:tabs>
+        <w:rPr>
+          <w:bCs/>
+          <w:szCs w:val="22"/>
+          <w:lang w:val="en-US"/>
+        </w:rPr>
+      </w:pPr>
+    </w:p>
+    <w:p>
+      <w:pPr>
+        <w:tabs>
+          <w:tab w:val="right" w:pos="10800"/>
+        </w:tabs>
+        <w:rPr>
+          <w:bCs/>
+          <w:szCs w:val="22"/>
+          <w:lang w:val="en-US"/>
+        </w:rPr>
+      </w:pPr>
+      <w:r>
+        <w:rPr>
+          <w:b/>
+          <w:szCs w:val="22"/>
+          <w:lang w:val="en-US"/>
+        </w:rPr>
+        <w:t>Software Engineer</w:t>
+      </w:r>
+      <w:r>
+        <w:rPr>
+          <w:b/>
+          <w:szCs w:val="22"/>
+          <w:lang w:val="en-US"/>
+        </w:rPr>
+        <w:tab/>
+      </w:r>
+      <w:r>
+        <w:rPr>
+          <w:bCs/>
+          <w:szCs w:val="22"/>
+          <w:lang w:val="en-US"/>
+        </w:rPr>
+        <w:t>April 2022 – July 2023</w:t>
+      </w:r>
+    </w:p>
+    <w:p>
+      <w:pPr>
+        <w:tabs>
+          <w:tab w:val="right" w:pos="10800"/>
+        </w:tabs>
+        <w:rPr>
+          <w:bCs/>
+          <w:szCs w:val="22"/>
+          <w:lang w:val="en-US"/>
+        </w:rPr>
+      </w:pPr>
+      <w:proofErr w:type="spellStart"/>
+      <w:r>
+        <w:rPr>
+          <w:bCs/>
+          <w:szCs w:val="22"/>
+          <w:lang w:val="en-US"/>
+        </w:rPr>
+        <w:t>StaffWise</w:t>
+      </w:r>
+      <w:proofErr w:type="spellEnd"/>
+      <w:r>
+        <w:rPr>
+          <w:bCs/>
+          <w:szCs w:val="22"/>
+          <w:lang w:val="en-US"/>
+        </w:rPr>
+        <w:t>, Wichita, KS</w:t>
       </w:r>
     </w:p>
     <w:p>
@@ -819,7 +734,7 @@
           <w:szCs w:val="22"/>
           <w:lang w:val="en-US"/>
         </w:rPr>
-        <w:t>Constructing and executing state-based database development in Microsoft SQL Server</w:t>
+        <w:t>Applied TDD and Clean Architecture to produce a maintainable, well-tested codebase</w:t>
       </w:r>
     </w:p>
     <w:p>
@@ -845,7 +760,7 @@
           <w:szCs w:val="22"/>
           <w:lang w:val="en-US"/>
         </w:rPr>
-        <w:t>Implementing UI designs using React.js and REST API’s in Node.js</w:t>
+        <w:t>Managed state-based SQL Server migrations, ensuring safe and reproducible schema changes</w:t>
       </w:r>
     </w:p>
     <w:p>
@@ -871,7 +786,7 @@
           <w:szCs w:val="22"/>
           <w:lang w:val="en-US"/>
         </w:rPr>
-        <w:t>Architecting resources and services in Microsoft Azure using Terraform</w:t>
+        <w:t>Delivered production React UIs and Node.js REST APIs from design through deployment</w:t>
       </w:r>
     </w:p>
     <w:p>
@@ -897,86 +812,7 @@
           <w:szCs w:val="22"/>
           <w:lang w:val="en-US"/>
         </w:rPr>
-        <w:t>Collaborating with a team to guarantee continuous integration and deployment</w:t>
-      </w:r>
-    </w:p>
-    <w:p>
-      <w:pPr>
-        <w:tabs>
-          <w:tab w:val="right" w:pos="10800"/>
-        </w:tabs>
-        <w:ind w:left="0" w:firstLine="0"/>
-        <w:rPr>
-          <w:bCs/>
-          <w:szCs w:val="22"/>
-          <w:lang w:val="en-US"/>
-        </w:rPr>
-      </w:pPr>
-    </w:p>
-    <w:p>
-      <w:pPr>
-        <w:tabs>
-          <w:tab w:val="right" w:pos="10800"/>
-        </w:tabs>
-        <w:rPr>
-          <w:b/>
-          <w:szCs w:val="22"/>
-          <w:lang w:val="en-US"/>
-        </w:rPr>
-      </w:pPr>
-      <w:r>
-        <w:rPr>
-          <w:b/>
-          <w:szCs w:val="22"/>
-          <w:lang w:val="en-US"/>
-        </w:rPr>
-        <w:t>Software Engineer Intern</w:t>
-      </w:r>
-      <w:r>
-        <w:rPr>
-          <w:b/>
-          <w:szCs w:val="22"/>
-          <w:lang w:val="en-US"/>
-        </w:rPr>
-        <w:tab/>
-      </w:r>
-      <w:r>
-        <w:rPr>
-          <w:bCs/>
-          <w:szCs w:val="22"/>
-          <w:lang w:val="en-US"/>
-        </w:rPr>
-        <w:t>April 2023 – July 2023</w:t>
-      </w:r>
-    </w:p>
-    <w:p>
-      <w:pPr>
-        <w:tabs>
-          <w:tab w:val="right" w:pos="10800"/>
-        </w:tabs>
-        <w:rPr>
-          <w:bCs/>
-          <w:szCs w:val="22"/>
-          <w:lang w:val="en-US"/>
-        </w:rPr>
-      </w:pPr>
-      <w:proofErr w:type="spellStart"/>
-      <w:r>
-        <w:rPr>
-          <w:bCs/>
-          <w:szCs w:val="22"/>
-          <w:lang w:val="en-US"/>
-        </w:rPr>
-        <w:t>Nuvative</w:t>
-      </w:r>
-      <w:proofErr w:type="spellEnd"/>
-      <w:r>
-        <w:rPr>
-          <w:bCs/>
-          <w:szCs w:val="22"/>
-          <w:lang w:val="en-US"/>
-        </w:rPr>
-        <w:t>, Wichita, KS</w:t>
+        <w:t>Provisioned Azure infrastructure with Terraform, standardizing environments and eliminating manual configuration</w:t>
       </w:r>
     </w:p>
     <w:p>
@@ -1002,7 +838,72 @@
           <w:szCs w:val="22"/>
           <w:lang w:val="en-US"/>
         </w:rPr>
-        <w:t>Improved unit test coverage on multiple vital microservices by 20+%</w:t>
+        <w:t>Maintained CI/CD pipelines ensuring reliable automated delivery across the team</w:t>
+      </w:r>
+    </w:p>
+    <w:p>
+      <w:pPr>
+        <w:tabs>
+          <w:tab w:val="right" w:pos="10800"/>
+        </w:tabs>
+        <w:rPr>
+          <w:bCs/>
+          <w:szCs w:val="22"/>
+          <w:lang w:val="en-US"/>
+        </w:rPr>
+      </w:pPr>
+    </w:p>
+    <w:p>
+      <w:pPr>
+        <w:tabs>
+          <w:tab w:val="right" w:pos="10800"/>
+        </w:tabs>
+        <w:rPr>
+          <w:bCs/>
+          <w:szCs w:val="22"/>
+          <w:lang w:val="en-US"/>
+        </w:rPr>
+      </w:pPr>
+      <w:r>
+        <w:rPr>
+          <w:b/>
+          <w:szCs w:val="22"/>
+          <w:u w:val="single"/>
+          <w:lang w:val="en-US"/>
+        </w:rPr>
+        <w:t>PROJECTS</w:t>
+      </w:r>
+    </w:p>
+    <w:p>
+      <w:pPr>
+        <w:tabs>
+          <w:tab w:val="right" w:pos="10800"/>
+        </w:tabs>
+        <w:rPr>
+          <w:bCs/>
+          <w:szCs w:val="22"/>
+          <w:lang w:val="en-US"/>
+        </w:rPr>
+      </w:pPr>
+    </w:p>
+    <w:p>
+      <w:pPr>
+        <w:tabs>
+          <w:tab w:val="right" w:pos="10800"/>
+        </w:tabs>
+        <w:rPr>
+          <w:bCs/>
+          <w:szCs w:val="22"/>
+          <w:lang w:val="en-US"/>
+        </w:rPr>
+      </w:pPr>
+      <w:r>
+        <w:rPr>
+          <w:bCs/>
+          <w:szCs w:val="22"/>
+          <w:lang w:val="en-US"/>
+        </w:rPr>
+        <w:t>Spectrum Analyzer – Desktop Application</w:t>
       </w:r>
     </w:p>
     <w:p>
@@ -1028,7 +929,7 @@
           <w:szCs w:val="22"/>
           <w:lang w:val="en-US"/>
         </w:rPr>
-        <w:t>Contributed to C# microservices designed around business domains, emphasizing clean architecture and scalable design</w:t>
+        <w:t>Built a real-time 32-band FFT spectrum visualizer running on a Raspberry Pi</w:t>
       </w:r>
     </w:p>
     <w:p>
@@ -1054,102 +955,39 @@
           <w:szCs w:val="22"/>
           <w:lang w:val="en-US"/>
         </w:rPr>
-        <w:t>Followed Atomic Design principles to construct reusable React components for UI</w:t>
-      </w:r>
-    </w:p>
-    <w:p>
-      <w:pPr>
-        <w:tabs>
-          <w:tab w:val="right" w:pos="10800"/>
-        </w:tabs>
-        <w:ind w:left="0" w:firstLine="0"/>
-        <w:rPr>
-          <w:bCs/>
-          <w:szCs w:val="22"/>
-          <w:lang w:val="en-US"/>
-        </w:rPr>
-      </w:pPr>
-    </w:p>
-    <w:p>
-      <w:pPr>
-        <w:tabs>
-          <w:tab w:val="right" w:pos="10800"/>
-        </w:tabs>
-        <w:rPr>
-          <w:bCs/>
-          <w:szCs w:val="22"/>
-          <w:lang w:val="en-US"/>
-        </w:rPr>
-      </w:pPr>
-      <w:r>
-        <w:rPr>
-          <w:b/>
-          <w:szCs w:val="22"/>
-          <w:lang w:val="en-US"/>
-        </w:rPr>
-        <w:t>Software Devel</w:t>
-      </w:r>
-      <w:r>
-        <w:rPr>
-          <w:b/>
-          <w:szCs w:val="22"/>
-          <w:lang w:val="en-US"/>
-        </w:rPr>
-        <w:t>oper Intern</w:t>
-      </w:r>
-      <w:r>
-        <w:rPr>
-          <w:b/>
-          <w:szCs w:val="22"/>
-          <w:lang w:val="en-US"/>
-        </w:rPr>
-        <w:tab/>
-      </w:r>
-      <w:r>
-        <w:rPr>
-          <w:bCs/>
-          <w:szCs w:val="22"/>
-          <w:lang w:val="en-US"/>
-        </w:rPr>
-        <w:t>November 2022 – March 2023</w:t>
-      </w:r>
-    </w:p>
-    <w:p>
-      <w:pPr>
-        <w:tabs>
-          <w:tab w:val="right" w:pos="10800"/>
-        </w:tabs>
-        <w:rPr>
-          <w:bCs/>
-          <w:szCs w:val="22"/>
-          <w:lang w:val="en-US"/>
-        </w:rPr>
-      </w:pPr>
-      <w:proofErr w:type="spellStart"/>
-      <w:r>
-        <w:rPr>
-          <w:bCs/>
-          <w:szCs w:val="22"/>
-          <w:lang w:val="en-US"/>
-        </w:rPr>
-        <w:t>Pill</w:t>
-      </w:r>
-      <w:r>
-        <w:rPr>
-          <w:bCs/>
-          <w:szCs w:val="22"/>
-          <w:lang w:val="en-US"/>
-        </w:rPr>
-        <w:t>r</w:t>
-      </w:r>
-      <w:proofErr w:type="spellEnd"/>
-      <w:r>
-        <w:rPr>
-          <w:bCs/>
-          <w:szCs w:val="22"/>
-          <w:lang w:val="en-US"/>
-        </w:rPr>
-        <w:t>, Wichita, KS</w:t>
+        <w:t>Integrated on-device song identification using Olaf audio fingerprinting</w:t>
+      </w:r>
+    </w:p>
+    <w:p>
+      <w:pPr>
+        <w:tabs>
+          <w:tab w:val="right" w:pos="10800"/>
+        </w:tabs>
+        <w:rPr>
+          <w:bCs/>
+          <w:szCs w:val="22"/>
+          <w:lang w:val="en-US"/>
+        </w:rPr>
+      </w:pPr>
+    </w:p>
+    <w:p>
+      <w:pPr>
+        <w:tabs>
+          <w:tab w:val="right" w:pos="10800"/>
+        </w:tabs>
+        <w:rPr>
+          <w:bCs/>
+          <w:szCs w:val="22"/>
+          <w:lang w:val="en-US"/>
+        </w:rPr>
+      </w:pPr>
+      <w:r>
+        <w:rPr>
+          <w:bCs/>
+          <w:szCs w:val="22"/>
+          <w:lang w:val="en-US"/>
+        </w:rPr>
+        <w:t>Photography Infrastructure – Cloud Infrastructure</w:t>
       </w:r>
     </w:p>
     <w:p>
@@ -1175,7 +1013,7 @@
           <w:szCs w:val="22"/>
           <w:lang w:val="en-US"/>
         </w:rPr>
-        <w:t>Implemented UI for our endpoint management process flow in Vue.js</w:t>
+        <w:t>Built a serverless image processing pipeline that auto-converts full-res uploads to web and thumbnail formats on arrival</w:t>
       </w:r>
     </w:p>
     <w:p>
@@ -1201,70 +1039,39 @@
           <w:szCs w:val="22"/>
           <w:lang w:val="en-US"/>
         </w:rPr>
-        <w:t>Handled third party webhooks to ingest data using Python and Celery</w:t>
-      </w:r>
-    </w:p>
-    <w:p>
-      <w:pPr>
-        <w:tabs>
-          <w:tab w:val="right" w:pos="10800"/>
-        </w:tabs>
-        <w:rPr>
-          <w:bCs/>
-          <w:szCs w:val="22"/>
-          <w:lang w:val="en-US"/>
-        </w:rPr>
-      </w:pPr>
-    </w:p>
-    <w:p>
-      <w:pPr>
-        <w:tabs>
-          <w:tab w:val="right" w:pos="10800"/>
-        </w:tabs>
-        <w:rPr>
-          <w:bCs/>
-          <w:szCs w:val="22"/>
-          <w:lang w:val="en-US"/>
-        </w:rPr>
-      </w:pPr>
-      <w:r>
-        <w:rPr>
-          <w:b/>
-          <w:szCs w:val="22"/>
-          <w:u w:val="single"/>
-          <w:lang w:val="en-US"/>
-        </w:rPr>
-        <w:t>PROJECTS</w:t>
-      </w:r>
-    </w:p>
-    <w:p>
-      <w:pPr>
-        <w:tabs>
-          <w:tab w:val="right" w:pos="10800"/>
-        </w:tabs>
-        <w:rPr>
-          <w:b/>
-          <w:szCs w:val="22"/>
-          <w:lang w:val="en-US"/>
-        </w:rPr>
-      </w:pPr>
-      <w:proofErr w:type="spellStart"/>
-      <w:r>
-        <w:rPr>
-          <w:b/>
-          <w:szCs w:val="22"/>
-          <w:lang w:val="en-US"/>
-        </w:rPr>
-        <w:t>Astrorpheus</w:t>
-      </w:r>
-      <w:proofErr w:type="spellEnd"/>
-      <w:r>
-        <w:rPr>
-          <w:b/>
-          <w:szCs w:val="22"/>
-          <w:lang w:val="en-US"/>
-        </w:rPr>
-        <w:t xml:space="preserve"> – Web Application</w:t>
+        <w:t>Provisioned S3, Lambda, and IAM resources as code via AWS SAM with CI/CD through GitHub Actions</w:t>
+      </w:r>
+    </w:p>
+    <w:p>
+      <w:pPr>
+        <w:tabs>
+          <w:tab w:val="right" w:pos="10800"/>
+        </w:tabs>
+        <w:rPr>
+          <w:bCs/>
+          <w:szCs w:val="22"/>
+          <w:lang w:val="en-US"/>
+        </w:rPr>
+      </w:pPr>
+    </w:p>
+    <w:p>
+      <w:pPr>
+        <w:tabs>
+          <w:tab w:val="right" w:pos="10800"/>
+        </w:tabs>
+        <w:rPr>
+          <w:bCs/>
+          <w:szCs w:val="22"/>
+          <w:lang w:val="en-US"/>
+        </w:rPr>
+      </w:pPr>
+      <w:r>
+        <w:rPr>
+          <w:bCs/>
+          <w:szCs w:val="22"/>
+          <w:lang w:val="en-US"/>
+        </w:rPr>
+        <w:t>Astrorpheus – Web Application</w:t>
       </w:r>
     </w:p>
     <w:p>
@@ -1316,152 +1123,7 @@
           <w:szCs w:val="22"/>
           <w:lang w:val="en-US"/>
         </w:rPr>
-        <w:t>Retrieved and served 3D point cloud models and audio files from S3</w:t>
-      </w:r>
-    </w:p>
-    <w:p>
-      <w:pPr>
-        <w:pStyle w:val="ListParagraph"/>
-        <w:numPr>
-          <w:ilvl w:val="0"/>
-          <w:numId w:val="3"/>
-        </w:numPr>
-        <w:tabs>
-          <w:tab w:val="right" w:pos="10800"/>
-        </w:tabs>
-        <w:ind w:left="360"/>
-        <w:rPr>
-          <w:bCs/>
-          <w:szCs w:val="22"/>
-          <w:lang w:val="en-US"/>
-        </w:rPr>
-      </w:pPr>
-      <w:r>
-        <w:rPr>
-          <w:bCs/>
-          <w:szCs w:val="22"/>
-          <w:lang w:val="en-US"/>
-        </w:rPr>
-        <w:t xml:space="preserve">Collaborated with a team on a strict deadline </w:t>
-      </w:r>
-      <w:r>
-        <w:rPr>
-          <w:bCs/>
-          <w:szCs w:val="22"/>
-          <w:lang w:val="en-US"/>
-        </w:rPr>
-        <w:t xml:space="preserve">and won </w:t>
-      </w:r>
-      <w:r>
-        <w:rPr>
-          <w:bCs/>
-          <w:szCs w:val="22"/>
-          <w:lang w:val="en-US"/>
-        </w:rPr>
-        <w:t>1</w:t>
-      </w:r>
-      <w:r>
-        <w:rPr>
-          <w:bCs/>
-          <w:szCs w:val="22"/>
-          <w:vertAlign w:val="superscript"/>
-          <w:lang w:val="en-US"/>
-        </w:rPr>
-        <w:t>st</w:t>
-      </w:r>
-      <w:r>
-        <w:rPr>
-          <w:bCs/>
-          <w:szCs w:val="22"/>
-          <w:lang w:val="en-US"/>
-        </w:rPr>
-        <w:t xml:space="preserve"> in the NASA Spaces App Challenge in Wichita, KS</w:t>
-      </w:r>
-    </w:p>
-    <w:p>
-      <w:pPr>
-        <w:tabs>
-          <w:tab w:val="right" w:pos="10800"/>
-        </w:tabs>
-        <w:rPr>
-          <w:bCs/>
-          <w:szCs w:val="22"/>
-          <w:lang w:val="en-US"/>
-        </w:rPr>
-      </w:pPr>
-    </w:p>
-    <w:p>
-      <w:pPr>
-        <w:tabs>
-          <w:tab w:val="right" w:pos="10800"/>
-        </w:tabs>
-        <w:rPr>
-          <w:bCs/>
-          <w:szCs w:val="22"/>
-          <w:lang w:val="en-US"/>
-        </w:rPr>
-      </w:pPr>
-      <w:proofErr w:type="spellStart"/>
-      <w:r>
-        <w:rPr>
-          <w:b/>
-          <w:szCs w:val="22"/>
-          <w:lang w:val="en-US"/>
-        </w:rPr>
-        <w:t>GymArc</w:t>
-      </w:r>
-      <w:proofErr w:type="spellEnd"/>
-      <w:r>
-        <w:rPr>
-          <w:b/>
-          <w:szCs w:val="22"/>
-          <w:lang w:val="en-US"/>
-        </w:rPr>
-        <w:t xml:space="preserve"> – Mobile Application</w:t>
-      </w:r>
-    </w:p>
-    <w:p>
-      <w:pPr>
-        <w:pStyle w:val="ListParagraph"/>
-        <w:numPr>
-          <w:ilvl w:val="0"/>
-          <w:numId w:val="3"/>
-        </w:numPr>
-        <w:tabs>
-          <w:tab w:val="right" w:pos="10800"/>
-        </w:tabs>
-        <w:ind w:left="360"/>
-        <w:rPr>
-          <w:bCs/>
-          <w:szCs w:val="22"/>
-          <w:lang w:val="en-US"/>
-        </w:rPr>
-      </w:pPr>
-      <w:r>
-        <w:rPr>
-          <w:bCs/>
-          <w:szCs w:val="22"/>
-          <w:lang w:val="en-US"/>
-        </w:rPr>
-        <w:t xml:space="preserve">Implemented UI in React Native and </w:t>
-      </w:r>
-      <w:proofErr w:type="spellStart"/>
-      <w:r>
-        <w:rPr>
-          <w:bCs/>
-          <w:szCs w:val="22"/>
-          <w:lang w:val="en-US"/>
-        </w:rPr>
-        <w:t>GraphQl</w:t>
-      </w:r>
-      <w:proofErr w:type="spellEnd"/>
-      <w:r>
-        <w:rPr>
-          <w:bCs/>
-          <w:szCs w:val="22"/>
-          <w:lang w:val="en-US"/>
-        </w:rPr>
-        <w:t xml:space="preserve"> API in Go</w:t>
+        <w:t>Won 1st place at the NASA Space Apps Challenge, Wichita, KS</w:t>
       </w:r>
     </w:p>
     <w:sectPr>

</xml_diff>